<commit_message>
completed composite key and unqiue key
</commit_message>
<xml_diff>
--- a/questions.docx
+++ b/questions.docx
@@ -6523,17 +6523,29 @@
       <w:pPr>
         <w:rPr>
           <w:rFonts w:cstheme="minorHAnsi"/>
-        </w:rPr>
-      </w:pPr>
-      <w:r>
-        <w:rPr>
-          <w:rFonts w:cstheme="minorHAnsi"/>
+          <w:b/>
+          <w:bCs/>
+          <w:sz w:val="36"/>
+          <w:szCs w:val="36"/>
+        </w:rPr>
+      </w:pPr>
+      <w:r>
+        <w:rPr>
+          <w:rFonts w:cstheme="minorHAnsi"/>
+          <w:b/>
+          <w:bCs/>
+          <w:sz w:val="36"/>
+          <w:szCs w:val="36"/>
         </w:rPr>
         <w:t>Unique Key</w:t>
       </w:r>
       <w:r>
         <w:rPr>
           <w:rFonts w:cstheme="minorHAnsi"/>
+          <w:b/>
+          <w:bCs/>
+          <w:sz w:val="36"/>
+          <w:szCs w:val="36"/>
         </w:rPr>
         <w:t>.</w:t>
       </w:r>
@@ -6544,13 +6556,480 @@
           <w:rFonts w:cstheme="minorHAnsi"/>
         </w:rPr>
       </w:pPr>
-    </w:p>
-    <w:p>
-      <w:pPr>
-        <w:rPr>
-          <w:rFonts w:cstheme="minorHAnsi"/>
-        </w:rPr>
-      </w:pPr>
+      <w:r>
+        <w:rPr>
+          <w:rFonts w:cstheme="minorHAnsi"/>
+        </w:rPr>
+        <w:t>In </w:t>
+      </w:r>
+      <w:r>
+        <w:rPr>
+          <w:rFonts w:cstheme="minorHAnsi"/>
+          <w:b/>
+          <w:bCs/>
+        </w:rPr>
+        <w:t>PostgreSQL</w:t>
+      </w:r>
+      <w:r>
+        <w:rPr>
+          <w:rFonts w:cstheme="minorHAnsi"/>
+        </w:rPr>
+        <w:t>, the </w:t>
+      </w:r>
+      <w:r>
+        <w:rPr>
+          <w:rFonts w:cstheme="minorHAnsi"/>
+          <w:b/>
+          <w:bCs/>
+        </w:rPr>
+        <w:t>UNIQUE </w:t>
+      </w:r>
+      <w:r>
+        <w:rPr>
+          <w:rFonts w:cstheme="minorHAnsi"/>
+        </w:rPr>
+        <w:t>constraint is a powerful tool used to ensure that values stored in a column or a group of columns are unique across rows in a table. This constraint is essential for maintaining data integrity, especially when certain data should not be duplicated. For instance, if you're storing email addresses, you wouldn't want the same email to be associated with multiple users. The </w:t>
+      </w:r>
+      <w:r>
+        <w:rPr>
+          <w:rFonts w:cstheme="minorHAnsi"/>
+          <w:b/>
+          <w:bCs/>
+        </w:rPr>
+        <w:t>UNIQUE </w:t>
+      </w:r>
+      <w:r>
+        <w:rPr>
+          <w:rFonts w:cstheme="minorHAnsi"/>
+        </w:rPr>
+        <w:t>constraint helps you enforce this rule at the database level.</w:t>
+      </w:r>
+    </w:p>
+    <w:p>
+      <w:pPr>
+        <w:rPr>
+          <w:rFonts w:cstheme="minorHAnsi"/>
+        </w:rPr>
+      </w:pPr>
+    </w:p>
+    <w:p>
+      <w:pPr>
+        <w:rPr>
+          <w:rFonts w:cstheme="minorHAnsi"/>
+        </w:rPr>
+      </w:pPr>
+      <w:r>
+        <w:rPr>
+          <w:rFonts w:cstheme="minorHAnsi"/>
+          <w:noProof/>
+        </w:rPr>
+        <w:lastRenderedPageBreak/>
+        <w:drawing>
+          <wp:inline distT="0" distB="0" distL="0" distR="0" wp14:anchorId="0F811B84" wp14:editId="5F334551">
+            <wp:extent cx="5943600" cy="1610995"/>
+            <wp:effectExtent l="0" t="0" r="0" b="8255"/>
+            <wp:docPr id="1258993374" name="Picture 1"/>
+            <wp:cNvGraphicFramePr>
+              <a:graphicFrameLocks xmlns:a="http://schemas.openxmlformats.org/drawingml/2006/main" noChangeAspect="1"/>
+            </wp:cNvGraphicFramePr>
+            <a:graphic xmlns:a="http://schemas.openxmlformats.org/drawingml/2006/main">
+              <a:graphicData uri="http://schemas.openxmlformats.org/drawingml/2006/picture">
+                <pic:pic xmlns:pic="http://schemas.openxmlformats.org/drawingml/2006/picture">
+                  <pic:nvPicPr>
+                    <pic:cNvPr id="1258993374" name=""/>
+                    <pic:cNvPicPr/>
+                  </pic:nvPicPr>
+                  <pic:blipFill>
+                    <a:blip r:embed="rId17"/>
+                    <a:stretch>
+                      <a:fillRect/>
+                    </a:stretch>
+                  </pic:blipFill>
+                  <pic:spPr>
+                    <a:xfrm>
+                      <a:off x="0" y="0"/>
+                      <a:ext cx="5943600" cy="1610995"/>
+                    </a:xfrm>
+                    <a:prstGeom prst="rect">
+                      <a:avLst/>
+                    </a:prstGeom>
+                  </pic:spPr>
+                </pic:pic>
+              </a:graphicData>
+            </a:graphic>
+          </wp:inline>
+        </w:drawing>
+      </w:r>
+    </w:p>
+    <w:p>
+      <w:pPr>
+        <w:rPr>
+          <w:rFonts w:cstheme="minorHAnsi"/>
+          <w:b/>
+          <w:bCs/>
+        </w:rPr>
+      </w:pPr>
+      <w:r>
+        <w:rPr>
+          <w:rFonts w:cstheme="minorHAnsi"/>
+          <w:b/>
+          <w:bCs/>
+        </w:rPr>
+        <w:t>How NULL Works With Unique Key</w:t>
+      </w:r>
+    </w:p>
+    <w:p>
+      <w:pPr>
+        <w:rPr>
+          <w:rFonts w:cstheme="minorHAnsi"/>
+        </w:rPr>
+      </w:pPr>
+      <w:r>
+        <w:rPr>
+          <w:rFonts w:cstheme="minorHAnsi"/>
+        </w:rPr>
+        <w:t>This is critical. In PostgreSQL, NULL means "unknown". Two unknowns are not considered equal. So multiple NULLs are allowed in a unique column.</w:t>
+      </w:r>
+    </w:p>
+    <w:p>
+      <w:pPr>
+        <w:rPr>
+          <w:rFonts w:cstheme="minorHAnsi"/>
+        </w:rPr>
+      </w:pPr>
+    </w:p>
+    <w:p>
+      <w:pPr>
+        <w:rPr>
+          <w:rFonts w:cstheme="minorHAnsi"/>
+          <w:b/>
+          <w:bCs/>
+        </w:rPr>
+      </w:pPr>
+      <w:r>
+        <w:rPr>
+          <w:rFonts w:cstheme="minorHAnsi"/>
+          <w:b/>
+          <w:bCs/>
+        </w:rPr>
+        <w:t>Single Column Unique Constraint</w:t>
+      </w:r>
+    </w:p>
+    <w:p>
+      <w:pPr>
+        <w:rPr>
+          <w:rFonts w:cstheme="minorHAnsi"/>
+        </w:rPr>
+      </w:pPr>
+      <w:r>
+        <w:rPr>
+          <w:rFonts w:cstheme="minorHAnsi"/>
+        </w:rPr>
+        <w:t>The most basic form. One column must have all unique values.</w:t>
+      </w:r>
+    </w:p>
+    <w:p>
+      <w:pPr>
+        <w:rPr>
+          <w:rFonts w:cstheme="minorHAnsi"/>
+        </w:rPr>
+      </w:pPr>
+      <w:r>
+        <w:rPr>
+          <w:rFonts w:cstheme="minorHAnsi"/>
+        </w:rPr>
+        <w:drawing>
+          <wp:inline distT="0" distB="0" distL="0" distR="0" wp14:anchorId="5750D489" wp14:editId="52F67E09">
+            <wp:extent cx="5811061" cy="1838582"/>
+            <wp:effectExtent l="0" t="0" r="0" b="9525"/>
+            <wp:docPr id="1408600558" name="Picture 1"/>
+            <wp:cNvGraphicFramePr>
+              <a:graphicFrameLocks xmlns:a="http://schemas.openxmlformats.org/drawingml/2006/main" noChangeAspect="1"/>
+            </wp:cNvGraphicFramePr>
+            <a:graphic xmlns:a="http://schemas.openxmlformats.org/drawingml/2006/main">
+              <a:graphicData uri="http://schemas.openxmlformats.org/drawingml/2006/picture">
+                <pic:pic xmlns:pic="http://schemas.openxmlformats.org/drawingml/2006/picture">
+                  <pic:nvPicPr>
+                    <pic:cNvPr id="1408600558" name=""/>
+                    <pic:cNvPicPr/>
+                  </pic:nvPicPr>
+                  <pic:blipFill>
+                    <a:blip r:embed="rId18"/>
+                    <a:stretch>
+                      <a:fillRect/>
+                    </a:stretch>
+                  </pic:blipFill>
+                  <pic:spPr>
+                    <a:xfrm>
+                      <a:off x="0" y="0"/>
+                      <a:ext cx="5811061" cy="1838582"/>
+                    </a:xfrm>
+                    <a:prstGeom prst="rect">
+                      <a:avLst/>
+                    </a:prstGeom>
+                  </pic:spPr>
+                </pic:pic>
+              </a:graphicData>
+            </a:graphic>
+          </wp:inline>
+        </w:drawing>
+      </w:r>
+    </w:p>
+    <w:p>
+      <w:pPr>
+        <w:rPr>
+          <w:rFonts w:cstheme="minorHAnsi"/>
+        </w:rPr>
+      </w:pPr>
+      <w:r>
+        <w:rPr>
+          <w:rFonts w:cstheme="minorHAnsi"/>
+        </w:rPr>
+        <w:t>OR with a name (recommended):</w:t>
+      </w:r>
+    </w:p>
+    <w:p>
+      <w:pPr>
+        <w:rPr>
+          <w:rFonts w:cstheme="minorHAnsi"/>
+        </w:rPr>
+      </w:pPr>
+      <w:r>
+        <w:rPr>
+          <w:rFonts w:cstheme="minorHAnsi"/>
+        </w:rPr>
+        <w:drawing>
+          <wp:inline distT="0" distB="0" distL="0" distR="0" wp14:anchorId="446F280B" wp14:editId="775FFA7F">
+            <wp:extent cx="4734586" cy="2067213"/>
+            <wp:effectExtent l="0" t="0" r="8890" b="9525"/>
+            <wp:docPr id="1353251673" name="Picture 1"/>
+            <wp:cNvGraphicFramePr>
+              <a:graphicFrameLocks xmlns:a="http://schemas.openxmlformats.org/drawingml/2006/main" noChangeAspect="1"/>
+            </wp:cNvGraphicFramePr>
+            <a:graphic xmlns:a="http://schemas.openxmlformats.org/drawingml/2006/main">
+              <a:graphicData uri="http://schemas.openxmlformats.org/drawingml/2006/picture">
+                <pic:pic xmlns:pic="http://schemas.openxmlformats.org/drawingml/2006/picture">
+                  <pic:nvPicPr>
+                    <pic:cNvPr id="1353251673" name=""/>
+                    <pic:cNvPicPr/>
+                  </pic:nvPicPr>
+                  <pic:blipFill>
+                    <a:blip r:embed="rId19"/>
+                    <a:stretch>
+                      <a:fillRect/>
+                    </a:stretch>
+                  </pic:blipFill>
+                  <pic:spPr>
+                    <a:xfrm>
+                      <a:off x="0" y="0"/>
+                      <a:ext cx="4734586" cy="2067213"/>
+                    </a:xfrm>
+                    <a:prstGeom prst="rect">
+                      <a:avLst/>
+                    </a:prstGeom>
+                  </pic:spPr>
+                </pic:pic>
+              </a:graphicData>
+            </a:graphic>
+          </wp:inline>
+        </w:drawing>
+      </w:r>
+    </w:p>
+    <w:p>
+      <w:pPr>
+        <w:rPr>
+          <w:rFonts w:cstheme="minorHAnsi"/>
+          <w:b/>
+          <w:bCs/>
+        </w:rPr>
+      </w:pPr>
+      <w:r>
+        <w:rPr>
+          <w:rFonts w:cstheme="minorHAnsi"/>
+          <w:b/>
+          <w:bCs/>
+        </w:rPr>
+        <w:lastRenderedPageBreak/>
+        <w:t>Composite Unique Constraint (Multiple Columns Together)</w:t>
+      </w:r>
+    </w:p>
+    <w:p>
+      <w:pPr>
+        <w:rPr>
+          <w:rFonts w:cstheme="minorHAnsi"/>
+        </w:rPr>
+      </w:pPr>
+      <w:r>
+        <w:rPr>
+          <w:rFonts w:cstheme="minorHAnsi"/>
+        </w:rPr>
+        <w:t>Uniqueness is enforced across a combination of columns, not each column individually.​</w:t>
+      </w:r>
+    </w:p>
+    <w:p>
+      <w:pPr>
+        <w:rPr>
+          <w:rFonts w:cstheme="minorHAnsi"/>
+        </w:rPr>
+      </w:pPr>
+      <w:r>
+        <w:rPr>
+          <w:rFonts w:cstheme="minorHAnsi"/>
+          <w:b/>
+          <w:bCs/>
+        </w:rPr>
+        <w:t>Use case:</w:t>
+      </w:r>
+      <w:r>
+        <w:rPr>
+          <w:rFonts w:cstheme="minorHAnsi"/>
+        </w:rPr>
+        <w:t> A student can enroll in the same course only once. But the same student can take other courses, and the same course can have other students.</w:t>
+      </w:r>
+    </w:p>
+    <w:p>
+      <w:pPr>
+        <w:rPr>
+          <w:rFonts w:cstheme="minorHAnsi"/>
+        </w:rPr>
+      </w:pPr>
+      <w:r>
+        <w:rPr>
+          <w:rFonts w:cstheme="minorHAnsi"/>
+        </w:rPr>
+        <w:drawing>
+          <wp:inline distT="0" distB="0" distL="0" distR="0" wp14:anchorId="1618D32A" wp14:editId="2BB2FD5F">
+            <wp:extent cx="5943600" cy="1705610"/>
+            <wp:effectExtent l="0" t="0" r="0" b="8890"/>
+            <wp:docPr id="395635007" name="Picture 1"/>
+            <wp:cNvGraphicFramePr>
+              <a:graphicFrameLocks xmlns:a="http://schemas.openxmlformats.org/drawingml/2006/main" noChangeAspect="1"/>
+            </wp:cNvGraphicFramePr>
+            <a:graphic xmlns:a="http://schemas.openxmlformats.org/drawingml/2006/main">
+              <a:graphicData uri="http://schemas.openxmlformats.org/drawingml/2006/picture">
+                <pic:pic xmlns:pic="http://schemas.openxmlformats.org/drawingml/2006/picture">
+                  <pic:nvPicPr>
+                    <pic:cNvPr id="395635007" name=""/>
+                    <pic:cNvPicPr/>
+                  </pic:nvPicPr>
+                  <pic:blipFill>
+                    <a:blip r:embed="rId20"/>
+                    <a:stretch>
+                      <a:fillRect/>
+                    </a:stretch>
+                  </pic:blipFill>
+                  <pic:spPr>
+                    <a:xfrm>
+                      <a:off x="0" y="0"/>
+                      <a:ext cx="5943600" cy="1705610"/>
+                    </a:xfrm>
+                    <a:prstGeom prst="rect">
+                      <a:avLst/>
+                    </a:prstGeom>
+                  </pic:spPr>
+                </pic:pic>
+              </a:graphicData>
+            </a:graphic>
+          </wp:inline>
+        </w:drawing>
+      </w:r>
+    </w:p>
+    <w:p>
+      <w:pPr>
+        <w:rPr>
+          <w:rFonts w:cstheme="minorHAnsi"/>
+          <w:b/>
+          <w:bCs/>
+        </w:rPr>
+      </w:pPr>
+      <w:r>
+        <w:rPr>
+          <w:rFonts w:cstheme="minorHAnsi"/>
+          <w:b/>
+          <w:bCs/>
+        </w:rPr>
+        <w:t>Adding Unique Constraint to an Existing Table</w:t>
+      </w:r>
+    </w:p>
+    <w:p>
+      <w:pPr>
+        <w:rPr>
+          <w:rFonts w:cstheme="minorHAnsi"/>
+        </w:rPr>
+      </w:pPr>
+      <w:r>
+        <w:rPr>
+          <w:rFonts w:cstheme="minorHAnsi"/>
+        </w:rPr>
+        <w:t>When the table already exists and you want to add a unique rule after:</w:t>
+      </w:r>
+    </w:p>
+    <w:p>
+      <w:pPr>
+        <w:rPr>
+          <w:rFonts w:cstheme="minorHAnsi"/>
+        </w:rPr>
+      </w:pPr>
+      <w:r>
+        <w:rPr>
+          <w:rFonts w:cstheme="minorHAnsi"/>
+        </w:rPr>
+        <w:drawing>
+          <wp:inline distT="0" distB="0" distL="0" distR="0" wp14:anchorId="667E919F" wp14:editId="3CB49A65">
+            <wp:extent cx="5943600" cy="791845"/>
+            <wp:effectExtent l="0" t="0" r="0" b="8255"/>
+            <wp:docPr id="58776764" name="Picture 1"/>
+            <wp:cNvGraphicFramePr>
+              <a:graphicFrameLocks xmlns:a="http://schemas.openxmlformats.org/drawingml/2006/main" noChangeAspect="1"/>
+            </wp:cNvGraphicFramePr>
+            <a:graphic xmlns:a="http://schemas.openxmlformats.org/drawingml/2006/main">
+              <a:graphicData uri="http://schemas.openxmlformats.org/drawingml/2006/picture">
+                <pic:pic xmlns:pic="http://schemas.openxmlformats.org/drawingml/2006/picture">
+                  <pic:nvPicPr>
+                    <pic:cNvPr id="58776764" name=""/>
+                    <pic:cNvPicPr/>
+                  </pic:nvPicPr>
+                  <pic:blipFill>
+                    <a:blip r:embed="rId21"/>
+                    <a:stretch>
+                      <a:fillRect/>
+                    </a:stretch>
+                  </pic:blipFill>
+                  <pic:spPr>
+                    <a:xfrm>
+                      <a:off x="0" y="0"/>
+                      <a:ext cx="5943600" cy="791845"/>
+                    </a:xfrm>
+                    <a:prstGeom prst="rect">
+                      <a:avLst/>
+                    </a:prstGeom>
+                  </pic:spPr>
+                </pic:pic>
+              </a:graphicData>
+            </a:graphic>
+          </wp:inline>
+        </w:drawing>
+      </w:r>
+    </w:p>
+    <w:p>
+      <w:pPr>
+        <w:rPr>
+          <w:rFonts w:cstheme="minorHAnsi"/>
+        </w:rPr>
+      </w:pPr>
+    </w:p>
+    <w:p>
+      <w:pPr>
+        <w:rPr>
+          <w:rFonts w:cstheme="minorHAnsi"/>
+        </w:rPr>
+      </w:pPr>
+      <w:r>
+        <w:rPr>
+          <w:rFonts w:cstheme="minorHAnsi"/>
+        </w:rPr>
+        <w:t>N</w:t>
+      </w:r>
       <w:r>
         <w:rPr>
           <w:rFonts w:cstheme="minorHAnsi"/>
@@ -6606,7 +7085,7 @@
       <w:pPr>
         <w:pStyle w:val="ListParagraph"/>
         <w:numPr>
-          <w:ilvl w:val="0"/>
+          <w:ilvl w:val="1"/>
           <w:numId w:val="35"/>
         </w:numPr>
         <w:rPr>
@@ -6617,7 +7096,7 @@
         <w:rPr>
           <w:rFonts w:cstheme="minorHAnsi"/>
         </w:rPr>
-        <w:t>Composite Unique Key</w:t>
+        <w:t>A composite key is a primary key made from two or more columns that together uniquely identify each record in a table. Individually, these columns may not be unique, but their combined values ensure uniqueness.</w:t>
       </w:r>
     </w:p>
     <w:p>
@@ -6635,8 +7114,7 @@
         <w:rPr>
           <w:rFonts w:cstheme="minorHAnsi"/>
         </w:rPr>
-        <w:lastRenderedPageBreak/>
-        <w:t>Partial Unique Index</w:t>
+        <w:t>Composite Unique Key</w:t>
       </w:r>
     </w:p>
     <w:p>
@@ -6654,6 +7132,24 @@
         <w:rPr>
           <w:rFonts w:cstheme="minorHAnsi"/>
         </w:rPr>
+        <w:t>Partial Unique Index</w:t>
+      </w:r>
+    </w:p>
+    <w:p>
+      <w:pPr>
+        <w:pStyle w:val="ListParagraph"/>
+        <w:numPr>
+          <w:ilvl w:val="0"/>
+          <w:numId w:val="35"/>
+        </w:numPr>
+        <w:rPr>
+          <w:rFonts w:cstheme="minorHAnsi"/>
+        </w:rPr>
+      </w:pPr>
+      <w:r>
+        <w:rPr>
+          <w:rFonts w:cstheme="minorHAnsi"/>
+        </w:rPr>
         <w:t>Exclusion Constraint</w:t>
       </w:r>
     </w:p>
@@ -6725,6 +7221,7 @@
         <w:rPr>
           <w:rFonts w:cstheme="minorHAnsi"/>
         </w:rPr>
+        <w:lastRenderedPageBreak/>
         <w:t>Partial Foreign Key</w:t>
       </w:r>
     </w:p>
@@ -7284,7 +7781,6 @@
         <w:rPr>
           <w:rFonts w:cstheme="minorHAnsi"/>
         </w:rPr>
-        <w:lastRenderedPageBreak/>
         <w:t>Usually used with GROUP BY and sometimes HAVING.</w:t>
       </w:r>
     </w:p>
@@ -7362,6 +7858,7 @@
         <w:rPr>
           <w:rFonts w:cstheme="minorHAnsi"/>
         </w:rPr>
+        <w:lastRenderedPageBreak/>
         <w:t>Conditional aggregation means applying an aggregate function (COUNT, SUM, AVG, MIN, MAX) to only specific rows that match a condition, all within a single query and a single GROUP BY.</w:t>
       </w:r>
     </w:p>
@@ -7427,7 +7924,7 @@
                     <pic:cNvPicPr/>
                   </pic:nvPicPr>
                   <pic:blipFill>
-                    <a:blip r:embed="rId17"/>
+                    <a:blip r:embed="rId22"/>
                     <a:stretch>
                       <a:fillRect/>
                     </a:stretch>
@@ -7482,7 +7979,7 @@
                     <pic:cNvPicPr/>
                   </pic:nvPicPr>
                   <pic:blipFill>
-                    <a:blip r:embed="rId18"/>
+                    <a:blip r:embed="rId23"/>
                     <a:stretch>
                       <a:fillRect/>
                     </a:stretch>
@@ -7594,64 +8091,64 @@
           <w:b/>
           <w:bCs/>
         </w:rPr>
+        <w:t>Pattern to remember:</w:t>
+      </w:r>
+    </w:p>
+    <w:p>
+      <w:pPr>
+        <w:rPr>
+          <w:rFonts w:cstheme="minorHAnsi"/>
+        </w:rPr>
+      </w:pPr>
+      <w:r>
+        <w:rPr>
+          <w:rFonts w:cstheme="minorHAnsi"/>
+        </w:rPr>
+        <w:t xml:space="preserve">SELECT ... FROM ... WHERE ... GROUP BY ... HAVING ... ORDER BY </w:t>
+      </w:r>
+      <w:proofErr w:type="spellStart"/>
+      <w:r>
+        <w:rPr>
+          <w:rFonts w:cstheme="minorHAnsi"/>
+        </w:rPr>
+        <w:t>column_or_expression</w:t>
+      </w:r>
+      <w:proofErr w:type="spellEnd"/>
+      <w:r>
+        <w:rPr>
+          <w:rFonts w:cstheme="minorHAnsi"/>
+        </w:rPr>
+        <w:t xml:space="preserve"> [ASC|DESC];</w:t>
+      </w:r>
+    </w:p>
+    <w:p>
+      <w:pPr>
+        <w:rPr>
+          <w:rFonts w:cstheme="minorHAnsi"/>
+          <w:b/>
+          <w:bCs/>
+        </w:rPr>
+      </w:pPr>
+      <w:r>
+        <w:rPr>
+          <w:rFonts w:cstheme="minorHAnsi"/>
+          <w:b/>
+          <w:bCs/>
+        </w:rPr>
+        <w:t>2. How it Works — Core Mechanics</w:t>
+      </w:r>
+    </w:p>
+    <w:p>
+      <w:pPr>
+        <w:rPr>
+          <w:rFonts w:cstheme="minorHAnsi"/>
+        </w:rPr>
+      </w:pPr>
+      <w:r>
+        <w:rPr>
+          <w:rFonts w:cstheme="minorHAnsi"/>
+        </w:rPr>
         <w:lastRenderedPageBreak/>
-        <w:t>Pattern to remember:</w:t>
-      </w:r>
-    </w:p>
-    <w:p>
-      <w:pPr>
-        <w:rPr>
-          <w:rFonts w:cstheme="minorHAnsi"/>
-        </w:rPr>
-      </w:pPr>
-      <w:r>
-        <w:rPr>
-          <w:rFonts w:cstheme="minorHAnsi"/>
-        </w:rPr>
-        <w:t xml:space="preserve">SELECT ... FROM ... WHERE ... GROUP BY ... HAVING ... ORDER BY </w:t>
-      </w:r>
-      <w:proofErr w:type="spellStart"/>
-      <w:r>
-        <w:rPr>
-          <w:rFonts w:cstheme="minorHAnsi"/>
-        </w:rPr>
-        <w:t>column_or_expression</w:t>
-      </w:r>
-      <w:proofErr w:type="spellEnd"/>
-      <w:r>
-        <w:rPr>
-          <w:rFonts w:cstheme="minorHAnsi"/>
-        </w:rPr>
-        <w:t xml:space="preserve"> [ASC|DESC];</w:t>
-      </w:r>
-    </w:p>
-    <w:p>
-      <w:pPr>
-        <w:rPr>
-          <w:rFonts w:cstheme="minorHAnsi"/>
-          <w:b/>
-          <w:bCs/>
-        </w:rPr>
-      </w:pPr>
-      <w:r>
-        <w:rPr>
-          <w:rFonts w:cstheme="minorHAnsi"/>
-          <w:b/>
-          <w:bCs/>
-        </w:rPr>
-        <w:t>2. How it Works — Core Mechanics</w:t>
-      </w:r>
-    </w:p>
-    <w:p>
-      <w:pPr>
-        <w:rPr>
-          <w:rFonts w:cstheme="minorHAnsi"/>
-        </w:rPr>
-      </w:pPr>
-      <w:r>
-        <w:rPr>
-          <w:rFonts w:cstheme="minorHAnsi"/>
-        </w:rPr>
         <w:t>The idea is to place a CASE WHEN expression </w:t>
       </w:r>
       <w:r>
@@ -7696,7 +8193,7 @@
                     <pic:cNvPicPr/>
                   </pic:nvPicPr>
                   <pic:blipFill>
-                    <a:blip r:embed="rId19"/>
+                    <a:blip r:embed="rId24"/>
                     <a:stretch>
                       <a:fillRect/>
                     </a:stretch>
@@ -7795,7 +8292,7 @@
                     <pic:cNvPicPr/>
                   </pic:nvPicPr>
                   <pic:blipFill>
-                    <a:blip r:embed="rId20"/>
+                    <a:blip r:embed="rId25"/>
                     <a:stretch>
                       <a:fillRect/>
                     </a:stretch>
@@ -7939,7 +8436,7 @@
                     <pic:cNvPicPr/>
                   </pic:nvPicPr>
                   <pic:blipFill>
-                    <a:blip r:embed="rId21"/>
+                    <a:blip r:embed="rId26"/>
                     <a:stretch>
                       <a:fillRect/>
                     </a:stretch>
@@ -8052,7 +8549,7 @@
                     <pic:cNvPicPr/>
                   </pic:nvPicPr>
                   <pic:blipFill>
-                    <a:blip r:embed="rId22"/>
+                    <a:blip r:embed="rId27"/>
                     <a:stretch>
                       <a:fillRect/>
                     </a:stretch>
@@ -8085,37 +8582,37 @@
           <w:b/>
           <w:bCs/>
         </w:rPr>
+        <w:t>Important:</w:t>
+      </w:r>
+      <w:r>
+        <w:rPr>
+          <w:rFonts w:cstheme="minorHAnsi"/>
+        </w:rPr>
+        <w:t> Do NOT use ELSE 0 with AVG. If you write ELSE 0, the zeros will be included in the average calculation and pull the result down incorrectly. Let non-matching rows return NULL so AVG ignores them.</w:t>
+      </w:r>
+    </w:p>
+    <w:p>
+      <w:pPr>
+        <w:rPr>
+          <w:rFonts w:cstheme="minorHAnsi"/>
+        </w:rPr>
+      </w:pPr>
+    </w:p>
+    <w:p>
+      <w:pPr>
+        <w:rPr>
+          <w:rFonts w:cstheme="minorHAnsi"/>
+          <w:b/>
+          <w:bCs/>
+        </w:rPr>
+      </w:pPr>
+      <w:r>
+        <w:rPr>
+          <w:rFonts w:cstheme="minorHAnsi"/>
+          <w:b/>
+          <w:bCs/>
+        </w:rPr>
         <w:lastRenderedPageBreak/>
-        <w:t>Important:</w:t>
-      </w:r>
-      <w:r>
-        <w:rPr>
-          <w:rFonts w:cstheme="minorHAnsi"/>
-        </w:rPr>
-        <w:t> Do NOT use ELSE 0 with AVG. If you write ELSE 0, the zeros will be included in the average calculation and pull the result down incorrectly. Let non-matching rows return NULL so AVG ignores them.</w:t>
-      </w:r>
-    </w:p>
-    <w:p>
-      <w:pPr>
-        <w:rPr>
-          <w:rFonts w:cstheme="minorHAnsi"/>
-        </w:rPr>
-      </w:pPr>
-    </w:p>
-    <w:p>
-      <w:pPr>
-        <w:rPr>
-          <w:rFonts w:cstheme="minorHAnsi"/>
-          <w:b/>
-          <w:bCs/>
-        </w:rPr>
-      </w:pPr>
-      <w:r>
-        <w:rPr>
-          <w:rFonts w:cstheme="minorHAnsi"/>
-          <w:b/>
-          <w:bCs/>
-        </w:rPr>
         <w:t>The ELSE 0 vs No ELSE Rule</w:t>
       </w:r>
     </w:p>
@@ -8146,7 +8643,7 @@
                     <pic:cNvPicPr/>
                   </pic:nvPicPr>
                   <pic:blipFill>
-                    <a:blip r:embed="rId23"/>
+                    <a:blip r:embed="rId28"/>
                     <a:stretch>
                       <a:fillRect/>
                     </a:stretch>
@@ -8231,7 +8728,7 @@
                     <pic:cNvPicPr/>
                   </pic:nvPicPr>
                   <pic:blipFill>
-                    <a:blip r:embed="rId24"/>
+                    <a:blip r:embed="rId29"/>
                     <a:stretch>
                       <a:fillRect/>
                     </a:stretch>
@@ -8349,7 +8846,6 @@
           <w:rFonts w:cstheme="minorHAnsi"/>
           <w:noProof/>
         </w:rPr>
-        <w:lastRenderedPageBreak/>
         <w:drawing>
           <wp:inline distT="0" distB="0" distL="0" distR="0" wp14:anchorId="70FDDC53" wp14:editId="1C07F2B5">
             <wp:extent cx="5943600" cy="2670810"/>
@@ -8366,7 +8862,7 @@
                     <pic:cNvPicPr/>
                   </pic:nvPicPr>
                   <pic:blipFill>
-                    <a:blip r:embed="rId25"/>
+                    <a:blip r:embed="rId30"/>
                     <a:stretch>
                       <a:fillRect/>
                     </a:stretch>
@@ -8399,6 +8895,7 @@
           <w:b/>
           <w:bCs/>
         </w:rPr>
+        <w:lastRenderedPageBreak/>
         <w:t>Use WHERE</w:t>
       </w:r>
       <w:r>
@@ -8509,7 +9006,7 @@
                     <pic:cNvPicPr/>
                   </pic:nvPicPr>
                   <pic:blipFill>
-                    <a:blip r:embed="rId26"/>
+                    <a:blip r:embed="rId31"/>
                     <a:stretch>
                       <a:fillRect/>
                     </a:stretch>
@@ -8614,7 +9111,7 @@
                     <pic:cNvPicPr/>
                   </pic:nvPicPr>
                   <pic:blipFill>
-                    <a:blip r:embed="rId27"/>
+                    <a:blip r:embed="rId32"/>
                     <a:stretch>
                       <a:fillRect/>
                     </a:stretch>
@@ -8675,7 +9172,6 @@
           <w:rFonts w:cstheme="minorHAnsi"/>
           <w:noProof/>
         </w:rPr>
-        <w:lastRenderedPageBreak/>
         <w:drawing>
           <wp:inline distT="0" distB="0" distL="0" distR="0" wp14:anchorId="16E0791C" wp14:editId="1FA93089">
             <wp:extent cx="5943600" cy="797560"/>
@@ -8692,7 +9188,7 @@
                     <pic:cNvPicPr/>
                   </pic:nvPicPr>
                   <pic:blipFill>
-                    <a:blip r:embed="rId28"/>
+                    <a:blip r:embed="rId33"/>
                     <a:stretch>
                       <a:fillRect/>
                     </a:stretch>
@@ -8808,6 +9304,7 @@
           <w:b/>
           <w:bCs/>
         </w:rPr>
+        <w:lastRenderedPageBreak/>
         <w:t>CTEs</w:t>
       </w:r>
       <w:r>
@@ -9101,7 +9598,6 @@
           <w:rFonts w:cstheme="minorHAnsi"/>
           <w:noProof/>
         </w:rPr>
-        <w:lastRenderedPageBreak/>
         <w:drawing>
           <wp:inline distT="0" distB="0" distL="0" distR="0" wp14:anchorId="2CF30E78" wp14:editId="6F132818">
             <wp:extent cx="5943600" cy="1901825"/>
@@ -9118,7 +9614,7 @@
                     <pic:cNvPicPr/>
                   </pic:nvPicPr>
                   <pic:blipFill>
-                    <a:blip r:embed="rId29"/>
+                    <a:blip r:embed="rId34"/>
                     <a:stretch>
                       <a:fillRect/>
                     </a:stretch>
@@ -9184,6 +9680,7 @@
           <w:rFonts w:cstheme="minorHAnsi"/>
           <w:noProof/>
         </w:rPr>
+        <w:lastRenderedPageBreak/>
         <w:drawing>
           <wp:inline distT="0" distB="0" distL="0" distR="0" wp14:anchorId="48C1ADEB" wp14:editId="1CD75F70">
             <wp:extent cx="5943600" cy="1342390"/>
@@ -9200,7 +9697,7 @@
                     <pic:cNvPicPr/>
                   </pic:nvPicPr>
                   <pic:blipFill>
-                    <a:blip r:embed="rId30"/>
+                    <a:blip r:embed="rId35"/>
                     <a:stretch>
                       <a:fillRect/>
                     </a:stretch>
@@ -9306,7 +9803,7 @@
                     <pic:cNvPicPr/>
                   </pic:nvPicPr>
                   <pic:blipFill>
-                    <a:blip r:embed="rId31"/>
+                    <a:blip r:embed="rId36"/>
                     <a:stretch>
                       <a:fillRect/>
                     </a:stretch>
@@ -9375,7 +9872,7 @@
                     <pic:cNvPicPr/>
                   </pic:nvPicPr>
                   <pic:blipFill>
-                    <a:blip r:embed="rId32"/>
+                    <a:blip r:embed="rId37"/>
                     <a:stretch>
                       <a:fillRect/>
                     </a:stretch>
@@ -9475,7 +9972,6 @@
         <w:rPr>
           <w:rFonts w:cstheme="minorHAnsi"/>
         </w:rPr>
-        <w:lastRenderedPageBreak/>
         <w:t>Always add spaces manually if needed: </w:t>
       </w:r>
       <w:proofErr w:type="spellStart"/>
@@ -9639,6 +10135,7 @@
           <w:b/>
           <w:bCs/>
         </w:rPr>
+        <w:lastRenderedPageBreak/>
         <w:t>Real-world analogy:</w:t>
       </w:r>
       <w:r>
@@ -9898,7 +10395,6 @@
           <w:b/>
           <w:bCs/>
         </w:rPr>
-        <w:lastRenderedPageBreak/>
         <w:t>3. Special Operators — IN and NOT IN</w:t>
       </w:r>
     </w:p>
@@ -9964,7 +10460,7 @@
                     <pic:cNvPicPr/>
                   </pic:nvPicPr>
                   <pic:blipFill>
-                    <a:blip r:embed="rId33"/>
+                    <a:blip r:embed="rId38"/>
                     <a:stretch>
                       <a:fillRect/>
                     </a:stretch>
@@ -10233,7 +10729,7 @@
                     <pic:cNvPicPr/>
                   </pic:nvPicPr>
                   <pic:blipFill>
-                    <a:blip r:embed="rId34"/>
+                    <a:blip r:embed="rId39"/>
                     <a:stretch>
                       <a:fillRect/>
                     </a:stretch>
@@ -10291,7 +10787,6 @@
           <w:rFonts w:cstheme="minorHAnsi"/>
           <w:noProof/>
         </w:rPr>
-        <w:lastRenderedPageBreak/>
         <w:drawing>
           <wp:inline distT="0" distB="0" distL="0" distR="0" wp14:anchorId="67B3CB6C" wp14:editId="19F28605">
             <wp:extent cx="5943600" cy="1948815"/>
@@ -10308,7 +10803,7 @@
                     <pic:cNvPicPr/>
                   </pic:nvPicPr>
                   <pic:blipFill>
-                    <a:blip r:embed="rId35"/>
+                    <a:blip r:embed="rId40"/>
                     <a:stretch>
                       <a:fillRect/>
                     </a:stretch>
@@ -10432,6 +10927,7 @@
           <w:rFonts w:cstheme="minorHAnsi"/>
           <w:noProof/>
         </w:rPr>
+        <w:lastRenderedPageBreak/>
         <w:drawing>
           <wp:inline distT="0" distB="0" distL="0" distR="0" wp14:anchorId="16C4D529" wp14:editId="183247D6">
             <wp:extent cx="5439534" cy="724001"/>
@@ -10448,7 +10944,7 @@
                     <pic:cNvPicPr/>
                   </pic:nvPicPr>
                   <pic:blipFill>
-                    <a:blip r:embed="rId36"/>
+                    <a:blip r:embed="rId41"/>
                     <a:stretch>
                       <a:fillRect/>
                     </a:stretch>
@@ -10511,7 +11007,7 @@
                     <pic:cNvPicPr/>
                   </pic:nvPicPr>
                   <pic:blipFill>
-                    <a:blip r:embed="rId37"/>
+                    <a:blip r:embed="rId42"/>
                     <a:stretch>
                       <a:fillRect/>
                     </a:stretch>
@@ -10599,7 +11095,6 @@
         <w:rPr>
           <w:rFonts w:cstheme="minorHAnsi"/>
         </w:rPr>
-        <w:lastRenderedPageBreak/>
         <w:t>If you reverse them (BETWEEN 80000 AND 40000), you get zero results because no number can be &gt;= 80000 AND &lt;= 40000 at the same time</w:t>
       </w:r>
     </w:p>
@@ -10707,6 +11202,7 @@
           <w:rFonts w:cstheme="minorHAnsi"/>
           <w:noProof/>
         </w:rPr>
+        <w:lastRenderedPageBreak/>
         <w:drawing>
           <wp:inline distT="0" distB="0" distL="0" distR="0" wp14:anchorId="7301BF98" wp14:editId="5B8FA0E1">
             <wp:extent cx="5943600" cy="1452245"/>
@@ -10723,7 +11219,7 @@
                     <pic:cNvPicPr/>
                   </pic:nvPicPr>
                   <pic:blipFill>
-                    <a:blip r:embed="rId38"/>
+                    <a:blip r:embed="rId43"/>
                     <a:stretch>
                       <a:fillRect/>
                     </a:stretch>
@@ -10847,7 +11343,7 @@
                     <pic:cNvPicPr/>
                   </pic:nvPicPr>
                   <pic:blipFill>
-                    <a:blip r:embed="rId39"/>
+                    <a:blip r:embed="rId44"/>
                     <a:stretch>
                       <a:fillRect/>
                     </a:stretch>
@@ -11083,7 +11579,7 @@
                     <pic:cNvPicPr/>
                   </pic:nvPicPr>
                   <pic:blipFill>
-                    <a:blip r:embed="rId40"/>
+                    <a:blip r:embed="rId45"/>
                     <a:stretch>
                       <a:fillRect/>
                     </a:stretch>
@@ -11229,7 +11725,7 @@
                     <pic:cNvPicPr/>
                   </pic:nvPicPr>
                   <pic:blipFill>
-                    <a:blip r:embed="rId41"/>
+                    <a:blip r:embed="rId46"/>
                     <a:stretch>
                       <a:fillRect/>
                     </a:stretch>
@@ -11285,7 +11781,7 @@
                     <pic:cNvPicPr/>
                   </pic:nvPicPr>
                   <pic:blipFill>
-                    <a:blip r:embed="rId42"/>
+                    <a:blip r:embed="rId47"/>
                     <a:stretch>
                       <a:fillRect/>
                     </a:stretch>
@@ -11333,7 +11829,7 @@
                     <pic:cNvPicPr/>
                   </pic:nvPicPr>
                   <pic:blipFill>
-                    <a:blip r:embed="rId43"/>
+                    <a:blip r:embed="rId48"/>
                     <a:stretch>
                       <a:fillRect/>
                     </a:stretch>
@@ -11562,7 +12058,7 @@
                     <pic:cNvPicPr/>
                   </pic:nvPicPr>
                   <pic:blipFill>
-                    <a:blip r:embed="rId44"/>
+                    <a:blip r:embed="rId49"/>
                     <a:stretch>
                       <a:fillRect/>
                     </a:stretch>
@@ -12246,7 +12742,7 @@
                     <pic:cNvPicPr/>
                   </pic:nvPicPr>
                   <pic:blipFill>
-                    <a:blip r:embed="rId45"/>
+                    <a:blip r:embed="rId50"/>
                     <a:stretch>
                       <a:fillRect/>
                     </a:stretch>
@@ -12539,7 +13035,7 @@
                     <pic:cNvPicPr/>
                   </pic:nvPicPr>
                   <pic:blipFill>
-                    <a:blip r:embed="rId46"/>
+                    <a:blip r:embed="rId51"/>
                     <a:stretch>
                       <a:fillRect/>
                     </a:stretch>
@@ -12745,7 +13241,7 @@
                     <pic:cNvPicPr/>
                   </pic:nvPicPr>
                   <pic:blipFill>
-                    <a:blip r:embed="rId47"/>
+                    <a:blip r:embed="rId52"/>
                     <a:stretch>
                       <a:fillRect/>
                     </a:stretch>
@@ -12869,7 +13365,7 @@
                     <pic:cNvPicPr/>
                   </pic:nvPicPr>
                   <pic:blipFill>
-                    <a:blip r:embed="rId48"/>
+                    <a:blip r:embed="rId53"/>
                     <a:stretch>
                       <a:fillRect/>
                     </a:stretch>
@@ -13005,7 +13501,7 @@
                     <pic:cNvPicPr/>
                   </pic:nvPicPr>
                   <pic:blipFill>
-                    <a:blip r:embed="rId49"/>
+                    <a:blip r:embed="rId54"/>
                     <a:stretch>
                       <a:fillRect/>
                     </a:stretch>
@@ -13145,7 +13641,7 @@
                     <pic:cNvPicPr/>
                   </pic:nvPicPr>
                   <pic:blipFill>
-                    <a:blip r:embed="rId50"/>
+                    <a:blip r:embed="rId55"/>
                     <a:stretch>
                       <a:fillRect/>
                     </a:stretch>
@@ -13246,7 +13742,7 @@
                     <pic:cNvPicPr/>
                   </pic:nvPicPr>
                   <pic:blipFill>
-                    <a:blip r:embed="rId51"/>
+                    <a:blip r:embed="rId56"/>
                     <a:stretch>
                       <a:fillRect/>
                     </a:stretch>
@@ -13383,7 +13879,7 @@
                     <pic:cNvPicPr/>
                   </pic:nvPicPr>
                   <pic:blipFill>
-                    <a:blip r:embed="rId52"/>
+                    <a:blip r:embed="rId57"/>
                     <a:stretch>
                       <a:fillRect/>
                     </a:stretch>
@@ -13451,7 +13947,7 @@
                     <pic:cNvPicPr/>
                   </pic:nvPicPr>
                   <pic:blipFill>
-                    <a:blip r:embed="rId53"/>
+                    <a:blip r:embed="rId58"/>
                     <a:stretch>
                       <a:fillRect/>
                     </a:stretch>
@@ -13499,7 +13995,7 @@
                     <pic:cNvPicPr/>
                   </pic:nvPicPr>
                   <pic:blipFill>
-                    <a:blip r:embed="rId54"/>
+                    <a:blip r:embed="rId59"/>
                     <a:stretch>
                       <a:fillRect/>
                     </a:stretch>
@@ -19166,7 +19662,7 @@
         <w:rFonts w:ascii="Symbol" w:hAnsi="Symbol" w:hint="default"/>
       </w:rPr>
     </w:lvl>
-    <w:lvl w:ilvl="1" w:tplc="04090003" w:tentative="1">
+    <w:lvl w:ilvl="1" w:tplc="04090003">
       <w:start w:val="1"/>
       <w:numFmt w:val="bullet"/>
       <w:lvlText w:val="o"/>

</xml_diff>

<commit_message>
created the DDL questions
</commit_message>
<xml_diff>
--- a/questions.docx
+++ b/questions.docx
@@ -16,18 +16,8 @@
           <w:b/>
           <w:bCs/>
         </w:rPr>
-        <w:t xml:space="preserve">What is </w:t>
-      </w:r>
-      <w:proofErr w:type="spellStart"/>
-      <w:r>
-        <w:rPr>
-          <w:rFonts w:cstheme="minorHAnsi"/>
-          <w:b/>
-          <w:bCs/>
-        </w:rPr>
-        <w:t>sql</w:t>
-      </w:r>
-      <w:proofErr w:type="spellEnd"/>
+        <w:t>What is sql</w:t>
+      </w:r>
     </w:p>
     <w:p>
       <w:pPr>
@@ -1124,21 +1114,7 @@
         <w:rPr>
           <w:rFonts w:cstheme="minorHAnsi"/>
         </w:rPr>
-        <w:t xml:space="preserve">A database must support high-level insertion, </w:t>
-      </w:r>
-      <w:proofErr w:type="spellStart"/>
-      <w:r>
-        <w:rPr>
-          <w:rFonts w:cstheme="minorHAnsi"/>
-        </w:rPr>
-        <w:t>updation</w:t>
-      </w:r>
-      <w:proofErr w:type="spellEnd"/>
-      <w:r>
-        <w:rPr>
-          <w:rFonts w:cstheme="minorHAnsi"/>
-        </w:rPr>
-        <w:t>, and deletion. This must not be limited to a single row, that is, it must also support union, intersection and minus operations to yield sets of data records.</w:t>
+        <w:t>A database must support high-level insertion, updation, and deletion. This must not be limited to a single row, that is, it must also support union, intersection and minus operations to yield sets of data records.</w:t>
       </w:r>
     </w:p>
     <w:p>
@@ -2714,21 +2690,7 @@
               <w:rPr>
                 <w:rFonts w:cstheme="minorHAnsi"/>
               </w:rPr>
-              <w:t xml:space="preserve">Date + Time (no </w:t>
-            </w:r>
-            <w:proofErr w:type="spellStart"/>
-            <w:r>
-              <w:rPr>
-                <w:rFonts w:cstheme="minorHAnsi"/>
-              </w:rPr>
-              <w:t>timezone</w:t>
-            </w:r>
-            <w:proofErr w:type="spellEnd"/>
-            <w:r>
-              <w:rPr>
-                <w:rFonts w:cstheme="minorHAnsi"/>
-              </w:rPr>
-              <w:t>)</w:t>
+              <w:t>Date + Time (no timezone)</w:t>
             </w:r>
           </w:p>
         </w:tc>
@@ -2829,21 +2791,7 @@
               <w:rPr>
                 <w:rFonts w:cstheme="minorHAnsi"/>
               </w:rPr>
-              <w:t xml:space="preserve">Date + Time (with </w:t>
-            </w:r>
-            <w:proofErr w:type="spellStart"/>
-            <w:r>
-              <w:rPr>
-                <w:rFonts w:cstheme="minorHAnsi"/>
-              </w:rPr>
-              <w:t>timezone</w:t>
-            </w:r>
-            <w:proofErr w:type="spellEnd"/>
-            <w:r>
-              <w:rPr>
-                <w:rFonts w:cstheme="minorHAnsi"/>
-              </w:rPr>
-              <w:t>, converts to UTC)</w:t>
+              <w:t>Date + Time (with timezone, converts to UTC)</w:t>
             </w:r>
           </w:p>
         </w:tc>
@@ -3337,16 +3285,8 @@
               <w:rPr>
                 <w:rFonts w:cstheme="minorHAnsi"/>
               </w:rPr>
-              <w:t>'</w:t>
+              <w:t>'yes'</w:t>
             </w:r>
-            <w:proofErr w:type="spellStart"/>
-            <w:r>
-              <w:rPr>
-                <w:rFonts w:cstheme="minorHAnsi"/>
-              </w:rPr>
-              <w:t>yes'</w:t>
-            </w:r>
-            <w:proofErr w:type="spellEnd"/>
           </w:p>
         </w:tc>
         <w:tc>
@@ -4410,25 +4350,7 @@
                 <w:b/>
                 <w:bCs/>
               </w:rPr>
-              <w:t>"</w:t>
-            </w:r>
-            <w:proofErr w:type="spellStart"/>
-            <w:r>
-              <w:rPr>
-                <w:rFonts w:cstheme="minorHAnsi"/>
-                <w:b/>
-                <w:bCs/>
-              </w:rPr>
-              <w:t>user_id</w:t>
-            </w:r>
-            <w:proofErr w:type="spellEnd"/>
-            <w:r>
-              <w:rPr>
-                <w:rFonts w:cstheme="minorHAnsi"/>
-                <w:b/>
-                <w:bCs/>
-              </w:rPr>
-              <w:t>", "first name"</w:t>
+              <w:t>"user_id", "first name"</w:t>
             </w:r>
           </w:p>
         </w:tc>
@@ -5577,35 +5499,7 @@
           <w:rFonts w:cstheme="minorHAnsi"/>
         </w:rPr>
         <w:br/>
-        <w:t xml:space="preserve">From relational algebra, selection is </w:t>
-      </w:r>
-      <w:proofErr w:type="spellStart"/>
-      <w:r>
-        <w:rPr>
-          <w:rFonts w:cstheme="minorHAnsi"/>
-        </w:rPr>
-        <w:t>σ_condition</w:t>
-      </w:r>
-      <w:proofErr w:type="spellEnd"/>
-      <w:r>
-        <w:rPr>
-          <w:rFonts w:cstheme="minorHAnsi"/>
-        </w:rPr>
-        <w:t xml:space="preserve">(relation), where condition is a </w:t>
-      </w:r>
-      <w:proofErr w:type="spellStart"/>
-      <w:r>
-        <w:rPr>
-          <w:rFonts w:cstheme="minorHAnsi"/>
-        </w:rPr>
-        <w:t>boolean</w:t>
-      </w:r>
-      <w:proofErr w:type="spellEnd"/>
-      <w:r>
-        <w:rPr>
-          <w:rFonts w:cstheme="minorHAnsi"/>
-        </w:rPr>
-        <w:t xml:space="preserve"> predicate like salary &gt; 50000. PostgreSQL WHERE clause implements this: rows not satisfying condition are discarded. It operates after FROM (including joins) but before GROUP BY/HAVING.</w:t>
+        <w:t>From relational algebra, selection is σ_condition(relation), where condition is a boolean predicate like salary &gt; 50000. PostgreSQL WHERE clause implements this: rows not satisfying condition are discarded. It operates after FROM (including joins) but before GROUP BY/HAVING.</w:t>
       </w:r>
     </w:p>
     <w:p>
@@ -7302,35 +7196,7 @@
         <w:rPr>
           <w:rFonts w:cstheme="minorHAnsi"/>
         </w:rPr>
-        <w:t>GIN/</w:t>
-      </w:r>
-      <w:proofErr w:type="spellStart"/>
-      <w:r>
-        <w:rPr>
-          <w:rFonts w:cstheme="minorHAnsi"/>
-        </w:rPr>
-        <w:t>GiST</w:t>
-      </w:r>
-      <w:proofErr w:type="spellEnd"/>
-      <w:r>
-        <w:rPr>
-          <w:rFonts w:cstheme="minorHAnsi"/>
-        </w:rPr>
-        <w:t>/SP-</w:t>
-      </w:r>
-      <w:proofErr w:type="spellStart"/>
-      <w:r>
-        <w:rPr>
-          <w:rFonts w:cstheme="minorHAnsi"/>
-        </w:rPr>
-        <w:t>GiST</w:t>
-      </w:r>
-      <w:proofErr w:type="spellEnd"/>
-      <w:r>
-        <w:rPr>
-          <w:rFonts w:cstheme="minorHAnsi"/>
-        </w:rPr>
-        <w:t xml:space="preserve"> Indexes</w:t>
+        <w:t>GIN/GiST/SP-GiST Indexes</w:t>
       </w:r>
     </w:p>
     <w:p>
@@ -7512,31 +7378,7 @@
           <w:kern w:val="0"/>
           <w14:ligatures w14:val="none"/>
         </w:rPr>
-        <w:t xml:space="preserve">LEFT JOIN keeps </w:t>
-      </w:r>
-      <w:proofErr w:type="spellStart"/>
-      <w:r>
-        <w:rPr>
-          <w:rFonts w:eastAsia="Times New Roman" w:cstheme="minorHAnsi"/>
-          <w:b/>
-          <w:bCs/>
-          <w:color w:val="000000"/>
-          <w:kern w:val="0"/>
-          <w14:ligatures w14:val="none"/>
-        </w:rPr>
-        <w:t>the</w:t>
-      </w:r>
-      <w:proofErr w:type="spellEnd"/>
-      <w:r>
-        <w:rPr>
-          <w:rFonts w:eastAsia="Times New Roman" w:cstheme="minorHAnsi"/>
-          <w:b/>
-          <w:bCs/>
-          <w:color w:val="000000"/>
-          <w:kern w:val="0"/>
-          <w14:ligatures w14:val="none"/>
-        </w:rPr>
-        <w:t xml:space="preserve"> FROM table completely</w:t>
+        <w:t>LEFT JOIN keeps the FROM table completely</w:t>
       </w:r>
     </w:p>
     <w:p>
@@ -8104,21 +7946,7 @@
         <w:rPr>
           <w:rFonts w:cstheme="minorHAnsi"/>
         </w:rPr>
-        <w:t xml:space="preserve">SELECT ... FROM ... WHERE ... GROUP BY ... HAVING ... ORDER BY </w:t>
-      </w:r>
-      <w:proofErr w:type="spellStart"/>
-      <w:r>
-        <w:rPr>
-          <w:rFonts w:cstheme="minorHAnsi"/>
-        </w:rPr>
-        <w:t>column_or_expression</w:t>
-      </w:r>
-      <w:proofErr w:type="spellEnd"/>
-      <w:r>
-        <w:rPr>
-          <w:rFonts w:cstheme="minorHAnsi"/>
-        </w:rPr>
-        <w:t xml:space="preserve"> [ASC|DESC];</w:t>
+        <w:t>SELECT ... FROM ... WHERE ... GROUP BY ... HAVING ... ORDER BY column_or_expression [ASC|DESC];</w:t>
       </w:r>
     </w:p>
     <w:p>
@@ -9972,35 +9800,7 @@
         <w:rPr>
           <w:rFonts w:cstheme="minorHAnsi"/>
         </w:rPr>
-        <w:t>Always add spaces manually if needed: </w:t>
-      </w:r>
-      <w:proofErr w:type="spellStart"/>
-      <w:r>
-        <w:rPr>
-          <w:rFonts w:cstheme="minorHAnsi"/>
-        </w:rPr>
-        <w:t>first_name</w:t>
-      </w:r>
-      <w:proofErr w:type="spellEnd"/>
-      <w:r>
-        <w:rPr>
-          <w:rFonts w:cstheme="minorHAnsi"/>
-        </w:rPr>
-        <w:t xml:space="preserve"> || ' ' || </w:t>
-      </w:r>
-      <w:proofErr w:type="spellStart"/>
-      <w:r>
-        <w:rPr>
-          <w:rFonts w:cstheme="minorHAnsi"/>
-        </w:rPr>
-        <w:t>last_name</w:t>
-      </w:r>
-      <w:proofErr w:type="spellEnd"/>
-      <w:r>
-        <w:rPr>
-          <w:rFonts w:cstheme="minorHAnsi"/>
-        </w:rPr>
-        <w:t> — that ' ' is the space character.</w:t>
+        <w:t>Always add spaces manually if needed: first_name || ' ' || last_name — that ' ' is the space character.</w:t>
       </w:r>
     </w:p>
     <w:p>
@@ -13542,21 +13342,7 @@
         <w:rPr>
           <w:rFonts w:cstheme="minorHAnsi"/>
         </w:rPr>
-        <w:t xml:space="preserve"> Always give the subquery an alias (AS </w:t>
-      </w:r>
-      <w:proofErr w:type="spellStart"/>
-      <w:r>
-        <w:rPr>
-          <w:rFonts w:cstheme="minorHAnsi"/>
-        </w:rPr>
-        <w:t>category_summary</w:t>
-      </w:r>
-      <w:proofErr w:type="spellEnd"/>
-      <w:r>
-        <w:rPr>
-          <w:rFonts w:cstheme="minorHAnsi"/>
-        </w:rPr>
-        <w:t>). PostgreSQL requires it.</w:t>
+        <w:t> Always give the subquery an alias (AS category_summary). PostgreSQL requires it.</w:t>
       </w:r>
     </w:p>
     <w:p>
@@ -14470,6 +14256,26 @@
     </w:p>
     <w:p>
       <w:pPr>
+        <w:pStyle w:val="ListParagraph"/>
+        <w:numPr>
+          <w:ilvl w:val="0"/>
+          <w:numId w:val="9"/>
+        </w:numPr>
+        <w:rPr>
+          <w:rFonts w:cstheme="minorHAnsi"/>
+        </w:rPr>
+      </w:pPr>
+      <w:r>
+        <w:rPr>
+          <w:rFonts w:cstheme="minorHAnsi"/>
+          <w:b/>
+          <w:bCs/>
+        </w:rPr>
+        <w:t>Comment</w:t>
+      </w:r>
+    </w:p>
+    <w:p>
+      <w:pPr>
         <w:rPr>
           <w:rFonts w:cstheme="minorHAnsi"/>
         </w:rPr>
@@ -15013,21 +14819,7 @@
         <w:rPr>
           <w:rFonts w:cstheme="minorHAnsi"/>
         </w:rPr>
-        <w:t xml:space="preserve">Value does not apply (e.g., </w:t>
-      </w:r>
-      <w:proofErr w:type="spellStart"/>
-      <w:r>
-        <w:rPr>
-          <w:rFonts w:cstheme="minorHAnsi"/>
-        </w:rPr>
-        <w:t>middle_name</w:t>
-      </w:r>
-      <w:proofErr w:type="spellEnd"/>
-      <w:r>
-        <w:rPr>
-          <w:rFonts w:cstheme="minorHAnsi"/>
-        </w:rPr>
-        <w:t xml:space="preserve"> for someone without one).</w:t>
+        <w:t>Value does not apply (e.g., middle_name for someone without one).</w:t>
       </w:r>
     </w:p>
     <w:p>
@@ -15312,14 +15104,12 @@
           <w:rFonts w:cstheme="minorHAnsi"/>
         </w:rPr>
       </w:pPr>
-      <w:proofErr w:type="spellStart"/>
       <w:r>
         <w:rPr>
           <w:rFonts w:cstheme="minorHAnsi"/>
         </w:rPr>
         <w:t>sql</w:t>
       </w:r>
-      <w:proofErr w:type="spellEnd"/>
     </w:p>
     <w:p>
       <w:pPr>
@@ -15429,14 +15219,12 @@
           <w:rFonts w:cstheme="minorHAnsi"/>
         </w:rPr>
       </w:pPr>
-      <w:proofErr w:type="spellStart"/>
       <w:r>
         <w:rPr>
           <w:rFonts w:cstheme="minorHAnsi"/>
         </w:rPr>
         <w:t>sql</w:t>
       </w:r>
-      <w:proofErr w:type="spellEnd"/>
     </w:p>
     <w:p>
       <w:pPr>

</xml_diff>